<commit_message>
Update: add new test reports (2026-10-28)
</commit_message>
<xml_diff>
--- a/Sprint20260907-20260918/HERO-58233_20260918_174348.docx
+++ b/Sprint20260907-20260918/HERO-58233_20260918_174348.docx
@@ -2282,132 +2282,6 @@
           <w:u w:val="none"/>
         </w:rPr>
         <w:t>: HQ Test Environment</w:t>
-      </w:r>
-    </w:p>
-    <w:p>
-      <w:pPr>
-        <w:spacing w:before="200" w:after="120"/>
-      </w:pPr>
-      <w:r>
-        <w:rPr>
-          <w:rFonts w:ascii="Arial" w:hAnsi="Arial" w:eastAsia="Arial" w:cs="Arial"/>
-          <w:b/>
-          <w:color w:val="000000"/>
-          <w:sz w:val="26"/>
-          <w:u w:val="single"/>
-        </w:rPr>
-        <w:t>Appendix</w:t>
-      </w:r>
-    </w:p>
-    <w:p>
-      <w:pPr>
-        <w:spacing w:before="160" w:after="80"/>
-      </w:pPr>
-      <w:r>
-        <w:rPr>
-          <w:rFonts w:ascii="Arial" w:hAnsi="Arial" w:eastAsia="Arial" w:cs="Arial"/>
-          <w:b/>
-          <w:color w:val="001EFF"/>
-          <w:sz w:val="24"/>
-          <w:u w:val="none"/>
-        </w:rPr>
-        <w:t>Acceptance Criteria(from JIRA)</w:t>
-      </w:r>
-    </w:p>
-    <w:p>
-      <w:pPr>
-        <w:spacing w:before="0" w:after="40"/>
-        <w:ind w:left="360" w:hanging="240"/>
-      </w:pPr>
-      <w:r>
-        <w:rPr>
-          <w:rFonts w:ascii="Arial" w:hAnsi="Arial" w:eastAsia="Arial" w:cs="Arial"/>
-          <w:b w:val="0"/>
-          <w:color w:val="000000"/>
-          <w:sz w:val="20"/>
-          <w:u w:val="none"/>
-        </w:rPr>
-        <w:t>1. Function key allows user to enter training mode from production manager/Admin screen with user rights control</w:t>
-      </w:r>
-    </w:p>
-    <w:p>
-      <w:pPr>
-        <w:spacing w:before="0" w:after="40"/>
-        <w:ind w:left="360" w:hanging="240"/>
-      </w:pPr>
-      <w:r>
-        <w:rPr>
-          <w:rFonts w:ascii="Arial" w:hAnsi="Arial" w:eastAsia="Arial" w:cs="Arial"/>
-          <w:b w:val="0"/>
-          <w:color w:val="000000"/>
-          <w:sz w:val="20"/>
-          <w:u w:val="none"/>
-        </w:rPr>
-        <w:t>2. Function key allows user to exit training mode from training mode manager/Admin screen with user rights control</w:t>
-      </w:r>
-    </w:p>
-    <w:p>
-      <w:pPr>
-        <w:spacing w:before="0" w:after="40"/>
-        <w:ind w:left="360" w:hanging="240"/>
-      </w:pPr>
-      <w:r>
-        <w:rPr>
-          <w:rFonts w:ascii="Arial" w:hAnsi="Arial" w:eastAsia="Arial" w:cs="Arial"/>
-          <w:b w:val="0"/>
-          <w:color w:val="000000"/>
-          <w:sz w:val="20"/>
-          <w:u w:val="none"/>
-        </w:rPr>
-        <w:t>3. If workstation has no training server configured or invalid URL, show error "can not find valid training server setting, please check with system administrator"</w:t>
-      </w:r>
-    </w:p>
-    <w:p>
-      <w:pPr>
-        <w:spacing w:before="0" w:after="40"/>
-        <w:ind w:left="360" w:hanging="240"/>
-      </w:pPr>
-      <w:r>
-        <w:rPr>
-          <w:rFonts w:ascii="Arial" w:hAnsi="Arial" w:eastAsia="Arial" w:cs="Arial"/>
-          <w:b w:val="0"/>
-          <w:color w:val="000000"/>
-          <w:sz w:val="20"/>
-          <w:u w:val="none"/>
-        </w:rPr>
-        <w:t>4. Operations are recorded into audit or action logs</w:t>
-      </w:r>
-    </w:p>
-    <w:p>
-      <w:pPr>
-        <w:spacing w:before="0" w:after="40"/>
-        <w:ind w:left="360" w:hanging="240"/>
-      </w:pPr>
-      <w:r>
-        <w:rPr>
-          <w:rFonts w:ascii="Arial" w:hAnsi="Arial" w:eastAsia="Arial" w:cs="Arial"/>
-          <w:b w:val="0"/>
-          <w:color w:val="000000"/>
-          <w:sz w:val="20"/>
-          <w:u w:val="none"/>
-        </w:rPr>
-        <w:t>5. Client setup name changes from "Enable Training Mode Server" to "Default Enter Training Mode"</w:t>
-      </w:r>
-    </w:p>
-    <w:p>
-      <w:pPr>
-        <w:spacing w:before="0" w:after="40"/>
-        <w:ind w:left="360" w:hanging="240"/>
-      </w:pPr>
-      <w:r>
-        <w:rPr>
-          <w:rFonts w:ascii="Arial" w:hAnsi="Arial" w:eastAsia="Arial" w:cs="Arial"/>
-          <w:b w:val="0"/>
-          <w:color w:val="000000"/>
-          <w:sz w:val="20"/>
-          <w:u w:val="none"/>
-        </w:rPr>
-        <w:t>6. Toggle Training Mode appears when Default Enter Training Mode is off and Training mode server has a value, or when Default Enter Training Mode is on</w:t>
       </w:r>
     </w:p>
     <w:sectPr>

</xml_diff>